<commit_message>
docs(grant_RAP_126): align documentation with RA respiration + export schema 2.2.0
- Technical documentation (EN/SK, .md + .docx): eSense Respiration is now
  described as raw respiration amplitude (RA), not br/min; new estimator
  description (breath-onset detection, 60 s window, smoothing + detrending +
  amplitude-scaled hysteresis) replacing the old 30 s zero-crossing method;
  added the live signal-quality warnings (SIGNAL_LOST / NO_BREATHING).
- Export schema bumped to 2.2.0: added scenarios[].respirationIssues (JSON)
  and the respiration_signal_lost / respiration_no_breathing header lines
  in CSV.
- Operational manual (EN/SK): guidance for the chest-strap warning banners
  and new rows in the troubleshooting table.
- Diagrams (01 architecture, 03 data model, 06 export schema) + regenerated
  PNGs: units corrected to RA, respirationIssues added.
</commit_message>
<xml_diff>
--- a/doc/grant_RAP_126/01_technical_documentation_en.docx
+++ b/doc/grant_RAP_126/01_technical_documentation_en.docx
@@ -2,32 +2,6 @@
 <file path=word/document.xml><?xml version="1.0" encoding="utf-8"?>
 <w:document xmlns:w="http://schemas.openxmlformats.org/wordprocessingml/2006/main" xmlns:m="http://schemas.openxmlformats.org/officeDocument/2006/math" xmlns:r="http://schemas.openxmlformats.org/officeDocument/2006/relationships" xmlns:o="urn:schemas-microsoft-com:office:office" xmlns:v="urn:schemas-microsoft-com:vml" xmlns:w10="urn:schemas-microsoft-com:office:word" xmlns:a="http://schemas.openxmlformats.org/drawingml/2006/main" xmlns:pic="http://schemas.openxmlformats.org/drawingml/2006/picture" xmlns:wp="http://schemas.openxmlformats.org/drawingml/2006/wordprocessingDrawing">
   <w:body>
-    <w:sdt>
-      <w:sdtPr>
-        <w:docPartObj>
-          <w:docPartGallery w:val="Table of Contents"/>
-          <w:docPartUnique/>
-        </w:docPartObj>
-      </w:sdtPr>
-      <w:sdtContent>
-        <w:p>
-          <w:pPr>
-            <w:pStyle w:val="TOCHeading"/>
-          </w:pPr>
-          <w:r>
-            <w:t xml:space="preserve">Table of Contents</w:t>
-          </w:r>
-        </w:p>
-        <w:p>
-          <w:r>
-            <w:fldChar w:fldCharType="begin" w:dirty="true"/>
-            <w:instrText xml:space="preserve">TOC \o "1-2" \h \z \u</w:instrText>
-            <w:fldChar w:fldCharType="separate"/>
-            <w:fldChar w:fldCharType="end"/>
-          </w:r>
-        </w:p>
-      </w:sdtContent>
-    </w:sdt>
     <w:bookmarkStart w:id="54" w:name="X9df6b25a06a745a61130234e29ee644add1afd4"/>
     <w:p>
       <w:pPr>
@@ -1324,7 +1298,57 @@
               <w:pStyle w:val="Compact"/>
             </w:pPr>
             <w:r>
-              <w:t xml:space="preserve">Breathing rate (breaths/min) from zero-crossing detection over a 30-second window — computed for the live display, not persisted as a sample</w:t>
+              <w:t xml:space="preserve">Breathing rate (breaths/min) from breath-onset detection (smoothing, baseline detrending, amplitude-scaled hysteresis) over a 60-second window — computed for the live display, not persisted as a sample</w:t>
+            </w:r>
+          </w:p>
+        </w:tc>
+      </w:tr>
+      <w:tr>
+        <w:tc>
+          <w:tcPr/>
+          <w:p>
+            <w:pPr>
+              <w:pStyle w:val="Compact"/>
+            </w:pPr>
+            <w:r>
+              <w:t xml:space="preserve">Live signal-quality warnings</w:t>
+            </w:r>
+          </w:p>
+        </w:tc>
+        <w:tc>
+          <w:tcPr/>
+          <w:p>
+            <w:pPr>
+              <w:pStyle w:val="Compact"/>
+            </w:pPr>
+            <w:r>
+              <w:rPr>
+                <w:b/>
+                <w:bCs/>
+              </w:rPr>
+              <w:t xml:space="preserve">Signal lost</w:t>
+            </w:r>
+            <w:r>
+              <w:t xml:space="preserve"> </w:t>
+            </w:r>
+            <w:r>
+              <w:t xml:space="preserve">(RA below 0.8 — strap slipped off the chest) and</w:t>
+            </w:r>
+            <w:r>
+              <w:t xml:space="preserve"> </w:t>
+            </w:r>
+            <w:r>
+              <w:rPr>
+                <w:b/>
+                <w:bCs/>
+              </w:rPr>
+              <w:t xml:space="preserve">No breathing detected</w:t>
+            </w:r>
+            <w:r>
+              <w:t xml:space="preserve"> </w:t>
+            </w:r>
+            <w:r>
+              <w:t xml:space="preserve">(healthy RA level but no breathing waveform) — shown as on-screen banners during setup and recording</w:t>
             </w:r>
           </w:p>
         </w:tc>
@@ -3599,13 +3623,63 @@
         <w:t xml:space="preserve"> </w:t>
       </w:r>
       <w:r>
-        <w:t xml:space="preserve">sampling rate. The breathing rate is derived from zero-crossing detection over a 30-second sliding</w:t>
-      </w:r>
-      <w:r>
-        <w:t xml:space="preserve"> </w:t>
-      </w:r>
-      <w:r>
-        <w:t xml:space="preserve">window.</w:t>
+        <w:t xml:space="preserve">sampling rate. The breathing rate shown in the UI is derived by a breath-onset estimator over a</w:t>
+      </w:r>
+      <w:r>
+        <w:t xml:space="preserve"> </w:t>
+      </w:r>
+      <w:r>
+        <w:t xml:space="preserve">60-second sliding window: the RA waveform is smoothed, detrended against a moving baseline, and</w:t>
+      </w:r>
+      <w:r>
+        <w:t xml:space="preserve"> </w:t>
+      </w:r>
+      <w:r>
+        <w:t xml:space="preserve">breath onsets are detected with an amplitude-scaled hysteresis; the rate is the trimmed median of</w:t>
+      </w:r>
+      <w:r>
+        <w:t xml:space="preserve"> </w:t>
+      </w:r>
+      <w:r>
+        <w:t xml:space="preserve">the inter-breath intervals. The estimator was tuned on real chest-strap recordings and also reports</w:t>
+      </w:r>
+      <w:r>
+        <w:t xml:space="preserve"> </w:t>
+      </w:r>
+      <w:r>
+        <w:t xml:space="preserve">two quality verdicts used for the live warnings:</w:t>
+      </w:r>
+      <w:r>
+        <w:t xml:space="preserve"> </w:t>
+      </w:r>
+      <w:r>
+        <w:rPr>
+          <w:i/>
+          <w:iCs/>
+        </w:rPr>
+        <w:t xml:space="preserve">signal lost</w:t>
+      </w:r>
+      <w:r>
+        <w:t xml:space="preserve"> </w:t>
+      </w:r>
+      <w:r>
+        <w:t xml:space="preserve">(RA &lt; 0.8 — strap off the chest) and</w:t>
+      </w:r>
+      <w:r>
+        <w:t xml:space="preserve"> </w:t>
+      </w:r>
+      <w:r>
+        <w:rPr>
+          <w:i/>
+          <w:iCs/>
+        </w:rPr>
+        <w:t xml:space="preserve">no breathing</w:t>
+      </w:r>
+      <w:r>
+        <w:t xml:space="preserve"> </w:t>
+      </w:r>
+      <w:r>
+        <w:t xml:space="preserve">(RA at a normal level but with no breathing modulation).</w:t>
       </w:r>
     </w:p>
     <w:bookmarkEnd w:id="25"/>
@@ -7166,13 +7240,13 @@
       </w:tr>
     </w:tbl>
     <w:bookmarkEnd w:id="49"/>
-    <w:bookmarkStart w:id="50" w:name="json-structure-schema-version-2.1.0"/>
+    <w:bookmarkStart w:id="50" w:name="json-structure-schema-version-2.2.0"/>
     <w:p>
       <w:pPr>
         <w:pStyle w:val="Heading3"/>
       </w:pPr>
       <w:r>
-        <w:t xml:space="preserve">11.2 JSON structure (schema version 2.1.0)</w:t>
+        <w:t xml:space="preserve">11.2 JSON structure (schema version 2.2.0)</w:t>
       </w:r>
     </w:p>
     <w:p>
@@ -7350,7 +7424,25 @@
               <w:rPr>
                 <w:rStyle w:val="VerbatimChar"/>
               </w:rPr>
-              <w:t xml:space="preserve">"2.1.0"</w:t>
+              <w:t xml:space="preserve">"2.2.0"</w:t>
+            </w:r>
+            <w:r>
+              <w:t xml:space="preserve"> </w:t>
+            </w:r>
+            <w:r>
+              <w:t xml:space="preserve">(2.2.0 added</w:t>
+            </w:r>
+            <w:r>
+              <w:t xml:space="preserve"> </w:t>
+            </w:r>
+            <w:r>
+              <w:rPr>
+                <w:rStyle w:val="VerbatimChar"/>
+              </w:rPr>
+              <w:t xml:space="preserve">scenarios[].respirationIssues</w:t>
+            </w:r>
+            <w:r>
+              <w:t xml:space="preserve">; otherwise identical to 2.1.0)</w:t>
             </w:r>
           </w:p>
         </w:tc>
@@ -8217,6 +8309,161 @@
               <w:rPr>
                 <w:rStyle w:val="VerbatimChar"/>
               </w:rPr>
+              <w:t xml:space="preserve">respirationIssues</w:t>
+            </w:r>
+          </w:p>
+        </w:tc>
+        <w:tc>
+          <w:tcPr/>
+          <w:p>
+            <w:pPr>
+              <w:pStyle w:val="Compact"/>
+            </w:pPr>
+            <w:r>
+              <w:t xml:space="preserve">object?</w:t>
+            </w:r>
+          </w:p>
+        </w:tc>
+        <w:tc>
+          <w:tcPr/>
+          <w:p>
+            <w:pPr>
+              <w:pStyle w:val="Compact"/>
+            </w:pPr>
+            <w:r>
+              <w:t xml:space="preserve">Stretches where respiration samples kept arriving but are unusable (a slipped strap produces no gap):</w:t>
+            </w:r>
+            <w:r>
+              <w:t xml:space="preserve"> </w:t>
+            </w:r>
+            <w:r>
+              <w:rPr>
+                <w:rStyle w:val="VerbatimChar"/>
+              </w:rPr>
+              <w:t xml:space="preserve">signalLostCount</w:t>
+            </w:r>
+            <w:r>
+              <w:t xml:space="preserve">,</w:t>
+            </w:r>
+            <w:r>
+              <w:t xml:space="preserve"> </w:t>
+            </w:r>
+            <w:r>
+              <w:rPr>
+                <w:rStyle w:val="VerbatimChar"/>
+              </w:rPr>
+              <w:t xml:space="preserve">signalLostTotalMs</w:t>
+            </w:r>
+            <w:r>
+              <w:t xml:space="preserve">,</w:t>
+            </w:r>
+            <w:r>
+              <w:t xml:space="preserve"> </w:t>
+            </w:r>
+            <w:r>
+              <w:rPr>
+                <w:rStyle w:val="VerbatimChar"/>
+              </w:rPr>
+              <w:t xml:space="preserve">noBreathingCount</w:t>
+            </w:r>
+            <w:r>
+              <w:t xml:space="preserve">,</w:t>
+            </w:r>
+            <w:r>
+              <w:t xml:space="preserve"> </w:t>
+            </w:r>
+            <w:r>
+              <w:rPr>
+                <w:rStyle w:val="VerbatimChar"/>
+              </w:rPr>
+              <w:t xml:space="preserve">noBreathingTotalMs</w:t>
+            </w:r>
+            <w:r>
+              <w:t xml:space="preserve">,</w:t>
+            </w:r>
+            <w:r>
+              <w:t xml:space="preserve"> </w:t>
+            </w:r>
+            <w:r>
+              <w:rPr>
+                <w:rStyle w:val="VerbatimChar"/>
+              </w:rPr>
+              <w:t xml:space="preserve">events[]{reason, startElapsedMs, endElapsedMs, durationMs}</w:t>
+            </w:r>
+            <w:r>
+              <w:t xml:space="preserve">;</w:t>
+            </w:r>
+            <w:r>
+              <w:t xml:space="preserve"> </w:t>
+            </w:r>
+            <w:r>
+              <w:rPr>
+                <w:rStyle w:val="VerbatimChar"/>
+              </w:rPr>
+              <w:t xml:space="preserve">reason</w:t>
+            </w:r>
+            <w:r>
+              <w:t xml:space="preserve"> </w:t>
+            </w:r>
+            <w:r>
+              <w:t xml:space="preserve">=</w:t>
+            </w:r>
+            <w:r>
+              <w:t xml:space="preserve"> </w:t>
+            </w:r>
+            <w:r>
+              <w:rPr>
+                <w:rStyle w:val="VerbatimChar"/>
+              </w:rPr>
+              <w:t xml:space="preserve">SIGNAL_LOST</w:t>
+            </w:r>
+            <w:r>
+              <w:t xml:space="preserve"> </w:t>
+            </w:r>
+            <w:r>
+              <w:t xml:space="preserve">or</w:t>
+            </w:r>
+            <w:r>
+              <w:t xml:space="preserve"> </w:t>
+            </w:r>
+            <w:r>
+              <w:rPr>
+                <w:rStyle w:val="VerbatimChar"/>
+              </w:rPr>
+              <w:t xml:space="preserve">NO_BREATHING</w:t>
+            </w:r>
+            <w:r>
+              <w:t xml:space="preserve">.</w:t>
+            </w:r>
+            <w:r>
+              <w:t xml:space="preserve"> </w:t>
+            </w:r>
+            <w:r>
+              <w:rPr>
+                <w:rStyle w:val="VerbatimChar"/>
+              </w:rPr>
+              <w:t xml:space="preserve">null</w:t>
+            </w:r>
+            <w:r>
+              <w:t xml:space="preserve"> </w:t>
+            </w:r>
+            <w:r>
+              <w:t xml:space="preserve">when there is nothing to report — including when the sensor was simply not connected. Derived at export from the recorded RA waveform.</w:t>
+            </w:r>
+          </w:p>
+        </w:tc>
+      </w:tr>
+      <w:tr>
+        <w:tc>
+          <w:tcPr/>
+          <w:p>
+            <w:pPr>
+              <w:pStyle w:val="Compact"/>
+            </w:pPr>
+            <w:r>
+              <w:rPr>
+                <w:rStyle w:val="VerbatimChar"/>
+              </w:rPr>
               <w:t xml:space="preserve">samples[]</w:t>
             </w:r>
           </w:p>
@@ -8543,7 +8790,7 @@
         <w:rPr>
           <w:rStyle w:val="StringTok"/>
         </w:rPr>
-        <w:t xml:space="preserve">"2.1.0"</w:t>
+        <w:t xml:space="preserve">"2.2.0"</w:t>
       </w:r>
       <w:r>
         <w:rPr>
@@ -9447,6 +9694,45 @@
           <w:rStyle w:val="DataTypeTok"/>
         </w:rPr>
         <w:t xml:space="preserve">"gaps"</w:t>
+      </w:r>
+      <w:r>
+        <w:rPr>
+          <w:rStyle w:val="FunctionTok"/>
+        </w:rPr>
+        <w:t xml:space="preserve">:</w:t>
+      </w:r>
+      <w:r>
+        <w:rPr>
+          <w:rStyle w:val="NormalTok"/>
+        </w:rPr>
+        <w:t xml:space="preserve"> </w:t>
+      </w:r>
+      <w:r>
+        <w:rPr>
+          <w:rStyle w:val="KeywordTok"/>
+        </w:rPr>
+        <w:t xml:space="preserve">null</w:t>
+      </w:r>
+      <w:r>
+        <w:rPr>
+          <w:rStyle w:val="FunctionTok"/>
+        </w:rPr>
+        <w:t xml:space="preserve">,</w:t>
+      </w:r>
+      <w:r>
+        <w:br/>
+      </w:r>
+      <w:r>
+        <w:rPr>
+          <w:rStyle w:val="NormalTok"/>
+        </w:rPr>
+        <w:t xml:space="preserve">      </w:t>
+      </w:r>
+      <w:r>
+        <w:rPr>
+          <w:rStyle w:val="DataTypeTok"/>
+        </w:rPr>
+        <w:t xml:space="preserve">"respirationIssues"</w:t>
       </w:r>
       <w:r>
         <w:rPr>
@@ -9981,7 +10267,73 @@
         <w:t xml:space="preserve">*_gap_total_ms</w:t>
       </w:r>
       <w:r>
-        <w:t xml:space="preserve">, only if any).</w:t>
+        <w:t xml:space="preserve">, only if any). Respiration signal-quality issues, if detected,</w:t>
+      </w:r>
+      <w:r>
+        <w:t xml:space="preserve"> </w:t>
+      </w:r>
+      <w:r>
+        <w:t xml:space="preserve">add</w:t>
+      </w:r>
+      <w:r>
+        <w:t xml:space="preserve"> </w:t>
+      </w:r>
+      <w:r>
+        <w:rPr>
+          <w:rStyle w:val="VerbatimChar"/>
+        </w:rPr>
+        <w:t xml:space="preserve">respiration_signal_lost</w:t>
+      </w:r>
+      <w:r>
+        <w:t xml:space="preserve"> </w:t>
+      </w:r>
+      <w:r>
+        <w:t xml:space="preserve">/</w:t>
+      </w:r>
+      <w:r>
+        <w:t xml:space="preserve"> </w:t>
+      </w:r>
+      <w:r>
+        <w:rPr>
+          <w:rStyle w:val="VerbatimChar"/>
+        </w:rPr>
+        <w:t xml:space="preserve">respiration_no_breathing</w:t>
+      </w:r>
+      <w:r>
+        <w:t xml:space="preserve"> </w:t>
+      </w:r>
+      <w:r>
+        <w:t xml:space="preserve">count lines with a</w:t>
+      </w:r>
+      <w:r>
+        <w:t xml:space="preserve"> </w:t>
+      </w:r>
+      <w:r>
+        <w:rPr>
+          <w:rStyle w:val="VerbatimChar"/>
+        </w:rPr>
+        <w:t xml:space="preserve">*_total_ms</w:t>
+      </w:r>
+      <w:r>
+        <w:t xml:space="preserve"> </w:t>
+      </w:r>
+      <w:r>
+        <w:t xml:space="preserve">line and</w:t>
+      </w:r>
+      <w:r>
+        <w:t xml:space="preserve"> </w:t>
+      </w:r>
+      <w:r>
+        <w:t xml:space="preserve">one positional line per event (</w:t>
+      </w:r>
+      <w:r>
+        <w:rPr>
+          <w:rStyle w:val="VerbatimChar"/>
+        </w:rPr>
+        <w:t xml:space="preserve"># respiration_signal_lost_1,&lt;startElapsedMs&gt;,&lt;endElapsedMs&gt;</w:t>
+      </w:r>
+      <w:r>
+        <w:t xml:space="preserve">).</w:t>
       </w:r>
     </w:p>
     <w:p>
@@ -11797,7 +12149,7 @@
       <w:color w:themeColor="accent1" w:themeShade="BF" w:val="365F91"/>
     </w:rPr>
   </w:style>
-  <w:style w:type="paragraph" w:customStyle="1" w:styleId="SourceCode">
+  <w:style w:customStyle="1" w:styleId="SourceCode" w:type="paragraph">
     <w:name w:val="Source Code"/>
     <w:basedOn w:val="Normal"/>
     <w:link w:val="VerbatimChar"/>
@@ -11805,7 +12157,7 @@
       <w:wordWrap w:val="off"/>
     </w:pPr>
   </w:style>
-  <w:style w:type="character" w:customStyle="1" w:styleId="KeywordTok">
+  <w:style w:customStyle="1" w:styleId="KeywordTok" w:type="character">
     <w:name w:val="KeywordTok"/>
     <w:basedOn w:val="VerbatimChar"/>
     <w:rPr>
@@ -11813,77 +12165,77 @@
       <w:color w:val="007020"/>
     </w:rPr>
   </w:style>
-  <w:style w:type="character" w:customStyle="1" w:styleId="DataTypeTok">
+  <w:style w:customStyle="1" w:styleId="DataTypeTok" w:type="character">
     <w:name w:val="DataTypeTok"/>
     <w:basedOn w:val="VerbatimChar"/>
     <w:rPr>
       <w:color w:val="902000"/>
     </w:rPr>
   </w:style>
-  <w:style w:type="character" w:customStyle="1" w:styleId="DecValTok">
+  <w:style w:customStyle="1" w:styleId="DecValTok" w:type="character">
     <w:name w:val="DecValTok"/>
     <w:basedOn w:val="VerbatimChar"/>
     <w:rPr>
       <w:color w:val="40a070"/>
     </w:rPr>
   </w:style>
-  <w:style w:type="character" w:customStyle="1" w:styleId="BaseNTok">
+  <w:style w:customStyle="1" w:styleId="BaseNTok" w:type="character">
     <w:name w:val="BaseNTok"/>
     <w:basedOn w:val="VerbatimChar"/>
     <w:rPr>
       <w:color w:val="40a070"/>
     </w:rPr>
   </w:style>
-  <w:style w:type="character" w:customStyle="1" w:styleId="FloatTok">
+  <w:style w:customStyle="1" w:styleId="FloatTok" w:type="character">
     <w:name w:val="FloatTok"/>
     <w:basedOn w:val="VerbatimChar"/>
     <w:rPr>
       <w:color w:val="40a070"/>
     </w:rPr>
   </w:style>
-  <w:style w:type="character" w:customStyle="1" w:styleId="ConstantTok">
+  <w:style w:customStyle="1" w:styleId="ConstantTok" w:type="character">
     <w:name w:val="ConstantTok"/>
     <w:basedOn w:val="VerbatimChar"/>
     <w:rPr>
       <w:color w:val="880000"/>
     </w:rPr>
   </w:style>
-  <w:style w:type="character" w:customStyle="1" w:styleId="CharTok">
+  <w:style w:customStyle="1" w:styleId="CharTok" w:type="character">
     <w:name w:val="CharTok"/>
     <w:basedOn w:val="VerbatimChar"/>
     <w:rPr>
       <w:color w:val="4070a0"/>
     </w:rPr>
   </w:style>
-  <w:style w:type="character" w:customStyle="1" w:styleId="SpecialCharTok">
+  <w:style w:customStyle="1" w:styleId="SpecialCharTok" w:type="character">
     <w:name w:val="SpecialCharTok"/>
     <w:basedOn w:val="VerbatimChar"/>
     <w:rPr>
       <w:color w:val="4070a0"/>
     </w:rPr>
   </w:style>
-  <w:style w:type="character" w:customStyle="1" w:styleId="StringTok">
+  <w:style w:customStyle="1" w:styleId="StringTok" w:type="character">
     <w:name w:val="StringTok"/>
     <w:basedOn w:val="VerbatimChar"/>
     <w:rPr>
       <w:color w:val="4070a0"/>
     </w:rPr>
   </w:style>
-  <w:style w:type="character" w:customStyle="1" w:styleId="VerbatimStringTok">
+  <w:style w:customStyle="1" w:styleId="VerbatimStringTok" w:type="character">
     <w:name w:val="VerbatimStringTok"/>
     <w:basedOn w:val="VerbatimChar"/>
     <w:rPr>
       <w:color w:val="4070a0"/>
     </w:rPr>
   </w:style>
-  <w:style w:type="character" w:customStyle="1" w:styleId="SpecialStringTok">
+  <w:style w:customStyle="1" w:styleId="SpecialStringTok" w:type="character">
     <w:name w:val="SpecialStringTok"/>
     <w:basedOn w:val="VerbatimChar"/>
     <w:rPr>
       <w:color w:val="bb6688"/>
     </w:rPr>
   </w:style>
-  <w:style w:type="character" w:customStyle="1" w:styleId="ImportTok">
+  <w:style w:customStyle="1" w:styleId="ImportTok" w:type="character">
     <w:name w:val="ImportTok"/>
     <w:basedOn w:val="VerbatimChar"/>
     <w:rPr>
@@ -11891,7 +12243,7 @@
       <w:color w:val="008000"/>
     </w:rPr>
   </w:style>
-  <w:style w:type="character" w:customStyle="1" w:styleId="CommentTok">
+  <w:style w:customStyle="1" w:styleId="CommentTok" w:type="character">
     <w:name w:val="CommentTok"/>
     <w:basedOn w:val="VerbatimChar"/>
     <w:rPr>
@@ -11899,7 +12251,7 @@
       <w:color w:val="60a0b0"/>
     </w:rPr>
   </w:style>
-  <w:style w:type="character" w:customStyle="1" w:styleId="DocumentationTok">
+  <w:style w:customStyle="1" w:styleId="DocumentationTok" w:type="character">
     <w:name w:val="DocumentationTok"/>
     <w:basedOn w:val="VerbatimChar"/>
     <w:rPr>
@@ -11907,7 +12259,7 @@
       <w:color w:val="ba2121"/>
     </w:rPr>
   </w:style>
-  <w:style w:type="character" w:customStyle="1" w:styleId="AnnotationTok">
+  <w:style w:customStyle="1" w:styleId="AnnotationTok" w:type="character">
     <w:name w:val="AnnotationTok"/>
     <w:basedOn w:val="VerbatimChar"/>
     <w:rPr>
@@ -11916,7 +12268,7 @@
       <w:color w:val="60a0b0"/>
     </w:rPr>
   </w:style>
-  <w:style w:type="character" w:customStyle="1" w:styleId="CommentVarTok">
+  <w:style w:customStyle="1" w:styleId="CommentVarTok" w:type="character">
     <w:name w:val="CommentVarTok"/>
     <w:basedOn w:val="VerbatimChar"/>
     <w:rPr>
@@ -11925,28 +12277,28 @@
       <w:color w:val="60a0b0"/>
     </w:rPr>
   </w:style>
-  <w:style w:type="character" w:customStyle="1" w:styleId="OtherTok">
+  <w:style w:customStyle="1" w:styleId="OtherTok" w:type="character">
     <w:name w:val="OtherTok"/>
     <w:basedOn w:val="VerbatimChar"/>
     <w:rPr>
       <w:color w:val="007020"/>
     </w:rPr>
   </w:style>
-  <w:style w:type="character" w:customStyle="1" w:styleId="FunctionTok">
+  <w:style w:customStyle="1" w:styleId="FunctionTok" w:type="character">
     <w:name w:val="FunctionTok"/>
     <w:basedOn w:val="VerbatimChar"/>
     <w:rPr>
       <w:color w:val="06287e"/>
     </w:rPr>
   </w:style>
-  <w:style w:type="character" w:customStyle="1" w:styleId="VariableTok">
+  <w:style w:customStyle="1" w:styleId="VariableTok" w:type="character">
     <w:name w:val="VariableTok"/>
     <w:basedOn w:val="VerbatimChar"/>
     <w:rPr>
       <w:color w:val="19177c"/>
     </w:rPr>
   </w:style>
-  <w:style w:type="character" w:customStyle="1" w:styleId="ControlFlowTok">
+  <w:style w:customStyle="1" w:styleId="ControlFlowTok" w:type="character">
     <w:name w:val="ControlFlowTok"/>
     <w:basedOn w:val="VerbatimChar"/>
     <w:rPr>
@@ -11954,45 +12306,45 @@
       <w:color w:val="007020"/>
     </w:rPr>
   </w:style>
-  <w:style w:type="character" w:customStyle="1" w:styleId="OperatorTok">
+  <w:style w:customStyle="1" w:styleId="OperatorTok" w:type="character">
     <w:name w:val="OperatorTok"/>
     <w:basedOn w:val="VerbatimChar"/>
     <w:rPr>
       <w:color w:val="666666"/>
     </w:rPr>
   </w:style>
-  <w:style w:type="character" w:customStyle="1" w:styleId="BuiltInTok">
+  <w:style w:customStyle="1" w:styleId="BuiltInTok" w:type="character">
     <w:name w:val="BuiltInTok"/>
     <w:basedOn w:val="VerbatimChar"/>
     <w:rPr>
       <w:color w:val="008000"/>
     </w:rPr>
   </w:style>
-  <w:style w:type="character" w:customStyle="1" w:styleId="ExtensionTok">
+  <w:style w:customStyle="1" w:styleId="ExtensionTok" w:type="character">
     <w:name w:val="ExtensionTok"/>
     <w:basedOn w:val="VerbatimChar"/>
     <w:rPr/>
   </w:style>
-  <w:style w:type="character" w:customStyle="1" w:styleId="PreprocessorTok">
+  <w:style w:customStyle="1" w:styleId="PreprocessorTok" w:type="character">
     <w:name w:val="PreprocessorTok"/>
     <w:basedOn w:val="VerbatimChar"/>
     <w:rPr>
       <w:color w:val="bc7a00"/>
     </w:rPr>
   </w:style>
-  <w:style w:type="character" w:customStyle="1" w:styleId="AttributeTok">
+  <w:style w:customStyle="1" w:styleId="AttributeTok" w:type="character">
     <w:name w:val="AttributeTok"/>
     <w:basedOn w:val="VerbatimChar"/>
     <w:rPr>
       <w:color w:val="7d9029"/>
     </w:rPr>
   </w:style>
-  <w:style w:type="character" w:customStyle="1" w:styleId="RegionMarkerTok">
+  <w:style w:customStyle="1" w:styleId="RegionMarkerTok" w:type="character">
     <w:name w:val="RegionMarkerTok"/>
     <w:basedOn w:val="VerbatimChar"/>
     <w:rPr/>
   </w:style>
-  <w:style w:type="character" w:customStyle="1" w:styleId="InformationTok">
+  <w:style w:customStyle="1" w:styleId="InformationTok" w:type="character">
     <w:name w:val="InformationTok"/>
     <w:basedOn w:val="VerbatimChar"/>
     <w:rPr>
@@ -12001,7 +12353,7 @@
       <w:color w:val="60a0b0"/>
     </w:rPr>
   </w:style>
-  <w:style w:type="character" w:customStyle="1" w:styleId="WarningTok">
+  <w:style w:customStyle="1" w:styleId="WarningTok" w:type="character">
     <w:name w:val="WarningTok"/>
     <w:basedOn w:val="VerbatimChar"/>
     <w:rPr>
@@ -12010,7 +12362,7 @@
       <w:color w:val="60a0b0"/>
     </w:rPr>
   </w:style>
-  <w:style w:type="character" w:customStyle="1" w:styleId="AlertTok">
+  <w:style w:customStyle="1" w:styleId="AlertTok" w:type="character">
     <w:name w:val="AlertTok"/>
     <w:basedOn w:val="VerbatimChar"/>
     <w:rPr>
@@ -12018,7 +12370,7 @@
       <w:color w:val="ff0000"/>
     </w:rPr>
   </w:style>
-  <w:style w:type="character" w:customStyle="1" w:styleId="ErrorTok">
+  <w:style w:customStyle="1" w:styleId="ErrorTok" w:type="character">
     <w:name w:val="ErrorTok"/>
     <w:basedOn w:val="VerbatimChar"/>
     <w:rPr>
@@ -12026,7 +12378,7 @@
       <w:color w:val="ff0000"/>
     </w:rPr>
   </w:style>
-  <w:style w:type="character" w:customStyle="1" w:styleId="NormalTok">
+  <w:style w:customStyle="1" w:styleId="NormalTok" w:type="character">
     <w:name w:val="NormalTok"/>
     <w:basedOn w:val="VerbatimChar"/>
     <w:rPr/>

</xml_diff>